<commit_message>
docs: publish J.O. Milestone 1 v3
</commit_message>
<xml_diff>
--- a/docs/J_O_INAI6986_Milestone1_v3.docx
+++ b/docs/J_O_INAI6986_Milestone1_v3.docx
@@ -36,7 +36,7 @@
         <w:rPr>
           <w:i w:val="0"/>
         </w:rPr>
-        <w:t>J.O.  •  Dr. David M. Simmonds  •  Evidence through September 28, 2026, 1:15 PM CDT</w:t>
+        <w:t>J.O.  •  Dr. David M. Simmonds  •  Evidence through September 28, 2026, 3:42 PM CDT</w:t>
       </w:r>
     </w:p>
     <w:tbl>
@@ -85,7 +85,7 @@
                 <w:color w:val="1F2937"/>
                 <w:sz w:val="18"/>
               </w:rPr>
-              <w:t>The original September 24 evidence remains historical; later work below is a post-feedback supplement, not evidence that it was available at the original deadline. The old September 17 Muse adapter is retained only for further evaluation. Gemma development runs are not a factual-accuracy comparison. No model has been promoted and the independent final control has not been spent.</w:t>
+              <w:t>The original September 24 evidence remains historical; later work below is a post-feedback supplement, not evidence that it was available at the original deadline. September 17/18 Muse runs are preserved as historical legacy experiments only; they do not use the new nested split-controlled protocol and are excluded from candidate selection. Gemma training/validation metrics are token-level fit diagnostics, not factual-accuracy comparisons. At the reporting cutoff, Gemma N=1,600 completed at step600/epoch3; checkpoint400 remains its best validation-loss checkpoint. A matched Muse sweep is next. No model has been promoted, and the independent final control/test remain unspent.</w:t>
             </w:r>
           </w:p>
         </w:tc>
@@ -705,7 +705,7 @@
                 <w:color w:val="1F2937"/>
                 <w:sz w:val="15"/>
               </w:rPr>
-              <w:t>Established local baseline; four-bit base and small trainable adapter reduce memory and retain rollback. Full merged deployment is not demonstrated.</w:t>
+              <w:t>Legacy four-bit baseline; adapters and historical outputs are preserved for provenance, not reused as matched candidates.</w:t>
             </w:r>
           </w:p>
         </w:tc>
@@ -732,7 +732,7 @@
                 <w:color w:val="1F2937"/>
                 <w:sz w:val="15"/>
               </w:rPr>
-              <w:t>Clean Sep. 17 run: 211 steps / 1 epoch. Sep. 18 is a different-render sensitivity run, not a distinct candidate.</w:t>
+              <w:t>Sep. 17 clean run and Sep. 18 different-render sensitivity run are historical/non-comparable; excluded from selection. Fresh Muse N=200/509/750/1,600 series is queued after Gemma N=1,600.</w:t>
             </w:r>
           </w:p>
         </w:tc>
@@ -793,7 +793,7 @@
                 <w:color w:val="1F2937"/>
                 <w:sz w:val="15"/>
               </w:rPr>
-              <w:t>Different mixture-of-experts architecture, smaller active footprint and explicit local training feasibility; tokenizer differs, so loss cannot rank it against Muse for factual answers.</w:t>
+              <w:t>Different mixture-of-experts architecture and tokenizer; token loss/accuracy cannot rank factual answers across model families.</w:t>
             </w:r>
           </w:p>
         </w:tc>
@@ -821,7 +821,7 @@
                 <w:color w:val="1F2937"/>
                 <w:sz w:val="15"/>
               </w:rPr>
-              <w:t>Pinned exact revision; BF16 backward/resume smokes passed. N=200 and N=509 project-data runs completed; N=750 active at the reporting cutoff; N=1,600 not started.</w:t>
+              <w:t>N=200, N=509, N=750 and N=1,600 project-data runs complete. N=1,600 stopped at step600/epoch3; best validation checkpoint400. Same fixed validation; no test/control rows used.</w:t>
             </w:r>
           </w:p>
         </w:tc>
@@ -880,7 +880,7 @@
                 <w:color w:val="1F2937"/>
                 <w:sz w:val="15"/>
               </w:rPr>
-              <w:t>Potential fast local serving, but license and exact architecture/hardware support require gates before training.</w:t>
+              <w:t>Official Megatron Bridge recipes document BF16 LoRA on H100/GB200; local RTX PRO/A6000 backward and checkpoint support is not proven.</w:t>
             </w:r>
           </w:p>
         </w:tc>
@@ -907,7 +907,7 @@
                 <w:color w:val="1F2937"/>
                 <w:sz w:val="15"/>
               </w:rPr>
-              <w:t>Considered; no verified project-data training or checkpoint gate.</w:t>
+              <w:t>Architecture-family documentation reviewed; exact local memory/backward/checkpoint gate remains open; no project-data training.</w:t>
             </w:r>
           </w:p>
         </w:tc>
@@ -968,7 +968,7 @@
                 <w:color w:val="1F2937"/>
                 <w:sz w:val="15"/>
               </w:rPr>
-              <w:t>Alternative sparse model; local shared-GPU memory fit is uncertain. Do not displace another service just to test it.</w:t>
+              <w:t>Qwen3.5 MoE family; family-level LoRA memory guidance does not prove this exact checkpoint fits or trains locally.</w:t>
             </w:r>
           </w:p>
         </w:tc>
@@ -996,7 +996,7 @@
                 <w:color w:val="1F2937"/>
                 <w:sz w:val="15"/>
               </w:rPr>
-              <w:t>Considered; inconclusive fit screen, no verified project-data training.</w:t>
+              <w:t>Exact backward/checkpoint support and local memory fit remain unverified; no project-data training.</w:t>
             </w:r>
           </w:p>
         </w:tc>
@@ -1024,7 +1024,7 @@
         <w:rPr>
           <w:i w:val="0"/>
         </w:rPr>
-        <w:t>The current-practice baseline is the student manually finding a source and writing an answer. On thirty simple, hand-authored code/page lookups, all thirty gold answers were source-validated; retrospectively paired session timestamps estimate 42:06 total (about 1:24 each). These are easy, non-blind lookups, not a stopwatch trial and not proof of time savings on policy reasoning. A second technical baseline is untouched Muse on the same frozen generated prompts as the two historical adapters; its human-scored pilot was 4/30. Neither baseline has yet been measured on the proposed harder control.</w:t>
+        <w:t>The current-practice baseline is the student manually finding a source and writing an answer. On thirty simple, hand-authored code/page lookups, all thirty gold answers were source-validated; retrospectively paired session timestamps estimate 42:06 total (about 1:24 each). These are easy, non-blind lookups, not a stopwatch trial and not proof of time savings on policy reasoning. A second technical baseline is untouched Muse on the same frozen generated prompts as the two historical legacy adapters; its human-scored pilot was 4/30. These legacy Muse runs are not candidates in the revised matched experiment. Neither baseline has yet been measured on the proposed harder control.</w:t>
       </w:r>
     </w:p>
     <w:tbl>
@@ -1322,7 +1322,7 @@
                 <w:color w:val="1F2937"/>
                 <w:sz w:val="14"/>
               </w:rPr>
-              <w:t>4/30 (13.3%)</w:t>
+              <w:t>4/30 (13.3%; historical)</w:t>
             </w:r>
           </w:p>
         </w:tc>
@@ -1403,7 +1403,7 @@
                 <w:color w:val="1F2937"/>
                 <w:sz w:val="14"/>
               </w:rPr>
-              <w:t>Only 1/1 historical safety response; insufficient denominator.</w:t>
+              <w:t>Retrospective base pilot; one safety response only, insufficient denominator.</w:t>
             </w:r>
           </w:p>
         </w:tc>
@@ -1436,7 +1436,7 @@
                 <w:color w:val="1F2937"/>
                 <w:sz w:val="14"/>
               </w:rPr>
-              <w:t>Sep. 17 clean Muse; historical generated pilot (n=30)</w:t>
+              <w:t>Sep. 17 clean Muse; historical legacy pilot (n=30)</w:t>
             </w:r>
           </w:p>
         </w:tc>
@@ -1464,7 +1464,7 @@
                 <w:color w:val="1F2937"/>
                 <w:sz w:val="14"/>
               </w:rPr>
-              <w:t>11/30 (36.7%)</w:t>
+              <w:t>11/30 (36.7%; historical)</w:t>
             </w:r>
           </w:p>
         </w:tc>
@@ -1520,7 +1520,7 @@
                 <w:color w:val="1F2937"/>
                 <w:sz w:val="14"/>
               </w:rPr>
-              <w:t>Loss 0.5722 (124 rows)</w:t>
+              <w:t>Loss 0.5722 (legacy cohort)</w:t>
             </w:r>
           </w:p>
         </w:tc>
@@ -1548,7 +1548,7 @@
                 <w:color w:val="1F2937"/>
                 <w:sz w:val="14"/>
               </w:rPr>
-              <w:t>0/1 historical abstentions; 4/191 outputs truncated; promotion gate failed.</w:t>
+              <w:t>Historical/non-comparable; excluded from selection; 0/1 abstentions; 4/191 truncated.</w:t>
             </w:r>
           </w:p>
         </w:tc>
@@ -1580,7 +1580,7 @@
                 <w:color w:val="1F2937"/>
                 <w:sz w:val="14"/>
               </w:rPr>
-              <w:t>Sep. 18 Muse sensitivity; historical generated pilot (n=30)</w:t>
+              <w:t>Sep. 18 Muse sensitivity; historical legacy pilot (n=30)</w:t>
             </w:r>
           </w:p>
         </w:tc>
@@ -1607,7 +1607,7 @@
                 <w:color w:val="1F2937"/>
                 <w:sz w:val="14"/>
               </w:rPr>
-              <w:t>9/30 (30.0%)</w:t>
+              <w:t>9/30 (30.0%; historical)</w:t>
             </w:r>
           </w:p>
         </w:tc>
@@ -1634,7 +1634,7 @@
                 <w:color w:val="1F2937"/>
                 <w:sz w:val="14"/>
               </w:rPr>
-              <w:t>Loss 0.6169 (1,685-row different render)</w:t>
+              <w:t>Loss 0.6169 (different 1,685-row render)</w:t>
             </w:r>
           </w:p>
         </w:tc>
@@ -1688,7 +1688,7 @@
                 <w:color w:val="1F2937"/>
                 <w:sz w:val="14"/>
               </w:rPr>
-              <w:t>Not a same-data architecture comparison.</w:t>
+              <w:t>Legacy/non-comparable; excluded from selection; not a same-data comparison.</w:t>
             </w:r>
           </w:p>
         </w:tc>
@@ -1946,7 +1946,7 @@
                 <w:color w:val="1F2937"/>
                 <w:sz w:val="14"/>
               </w:rPr>
-              <w:t>Best loss 0.6060 at epoch 2; epoch-5 loss 0.6636</w:t>
+              <w:t>Best loss 0.6060 at step 128; final loss 0.6636</w:t>
             </w:r>
           </w:p>
         </w:tc>
@@ -1973,7 +1973,7 @@
                 <w:color w:val="1F2937"/>
                 <w:sz w:val="14"/>
               </w:rPr>
-              <w:t>Best checkpoint step 128; no final-control/test records used.</w:t>
+              <w:t>Best checkpoint 128; run completed step 320; no test/control rows used.</w:t>
             </w:r>
           </w:p>
         </w:tc>
@@ -2006,7 +2006,7 @@
                 <w:color w:val="1F2937"/>
                 <w:sz w:val="14"/>
               </w:rPr>
-              <w:t>Gemma, N=750; provisional checkpoint at cutoff</w:t>
+              <w:t>Gemma, N=750; completed early-stop run</w:t>
             </w:r>
           </w:p>
         </w:tc>
@@ -2062,7 +2062,7 @@
                 <w:color w:val="1F2937"/>
                 <w:sz w:val="14"/>
               </w:rPr>
-              <w:t>Epoch 2 loss 0.4791; next-token 87.69%</w:t>
+              <w:t>Final step 376: loss 0.2192; next-token 93.62%</w:t>
             </w:r>
           </w:p>
         </w:tc>
@@ -2090,7 +2090,7 @@
                 <w:color w:val="1F2937"/>
                 <w:sz w:val="14"/>
               </w:rPr>
-              <w:t>Epoch 2 loss 0.5829; next-token 85.58%</w:t>
+              <w:t>Best step 188: loss 0.5829; next-token 85.58%</w:t>
             </w:r>
           </w:p>
         </w:tc>
@@ -2118,7 +2118,147 @@
                 <w:color w:val="1F2937"/>
                 <w:sz w:val="14"/>
               </w:rPr>
-              <w:t>Checkpoint 188 only; training active, not complete.</w:t>
+              <w:t>Completed step 376 after two non-improving validations; no test/control rows used.</w:t>
+            </w:r>
+          </w:p>
+        </w:tc>
+      </w:tr>
+      <w:tr>
+        <w:trPr>
+          <w:cantSplit/>
+        </w:trPr>
+        <w:tc>
+          <w:tcPr>
+            <w:tcW w:type="dxa" w:w="2232"/>
+            <w:vAlign w:val="center"/>
+            <w:tcMar>
+              <w:top w:w="55" w:type="dxa"/>
+              <w:start w:w="70" w:type="dxa"/>
+              <w:bottom w:w="55" w:type="dxa"/>
+              <w:end w:w="70" w:type="dxa"/>
+            </w:tcMar>
+          </w:tcPr>
+          <w:p>
+            <w:pPr>
+              <w:spacing w:before="0" w:after="0" w:line="240" w:lineRule="auto"/>
+            </w:pPr>
+            <w:r/>
+            <w:r>
+              <w:rPr>
+                <w:rFonts w:ascii="Aptos" w:hAnsi="Aptos"/>
+                <w:b w:val="0"/>
+                <w:color w:val="1F2937"/>
+                <w:sz w:val="14"/>
+              </w:rPr>
+              <w:t>Gemma, N=1,600; completed at step 600</w:t>
+            </w:r>
+          </w:p>
+        </w:tc>
+        <w:tc>
+          <w:tcPr>
+            <w:tcW w:type="dxa" w:w="1512"/>
+            <w:vAlign w:val="center"/>
+            <w:tcMar>
+              <w:top w:w="55" w:type="dxa"/>
+              <w:start w:w="70" w:type="dxa"/>
+              <w:bottom w:w="55" w:type="dxa"/>
+              <w:end w:w="70" w:type="dxa"/>
+            </w:tcMar>
+          </w:tcPr>
+          <w:p>
+            <w:pPr>
+              <w:spacing w:before="0" w:after="0" w:line="240" w:lineRule="auto"/>
+            </w:pPr>
+            <w:r/>
+            <w:r>
+              <w:rPr>
+                <w:rFonts w:ascii="Aptos" w:hAnsi="Aptos"/>
+                <w:b w:val="0"/>
+                <w:color w:val="1F2937"/>
+                <w:sz w:val="14"/>
+              </w:rPr>
+              <w:t>Not scored</w:t>
+            </w:r>
+          </w:p>
+        </w:tc>
+        <w:tc>
+          <w:tcPr>
+            <w:tcW w:type="dxa" w:w="2520"/>
+            <w:vAlign w:val="center"/>
+            <w:tcMar>
+              <w:top w:w="55" w:type="dxa"/>
+              <w:start w:w="70" w:type="dxa"/>
+              <w:bottom w:w="55" w:type="dxa"/>
+              <w:end w:w="70" w:type="dxa"/>
+            </w:tcMar>
+          </w:tcPr>
+          <w:p>
+            <w:pPr>
+              <w:spacing w:before="0" w:after="0" w:line="240" w:lineRule="auto"/>
+            </w:pPr>
+            <w:r/>
+            <w:r>
+              <w:rPr>
+                <w:rFonts w:ascii="Aptos" w:hAnsi="Aptos"/>
+                <w:b w:val="0"/>
+                <w:color w:val="1F2937"/>
+                <w:sz w:val="14"/>
+              </w:rPr>
+              <w:t>Step 600/epoch 3: loss 0.2435; next-token 93.05%</w:t>
+            </w:r>
+          </w:p>
+        </w:tc>
+        <w:tc>
+          <w:tcPr>
+            <w:tcW w:type="dxa" w:w="2592"/>
+            <w:vAlign w:val="center"/>
+            <w:tcMar>
+              <w:top w:w="55" w:type="dxa"/>
+              <w:start w:w="70" w:type="dxa"/>
+              <w:bottom w:w="55" w:type="dxa"/>
+              <w:end w:w="70" w:type="dxa"/>
+            </w:tcMar>
+          </w:tcPr>
+          <w:p>
+            <w:pPr>
+              <w:spacing w:before="0" w:after="0" w:line="240" w:lineRule="auto"/>
+            </w:pPr>
+            <w:r/>
+            <w:r>
+              <w:rPr>
+                <w:rFonts w:ascii="Aptos" w:hAnsi="Aptos"/>
+                <w:b w:val="0"/>
+                <w:color w:val="1F2937"/>
+                <w:sz w:val="14"/>
+              </w:rPr>
+              <w:t>Step 600/epoch 3: loss 0.6180; next-token 85.65%; best step 400: loss 0.5750; 85.88%</w:t>
+            </w:r>
+          </w:p>
+        </w:tc>
+        <w:tc>
+          <w:tcPr>
+            <w:tcW w:type="dxa" w:w="1800"/>
+            <w:vAlign w:val="center"/>
+            <w:tcMar>
+              <w:top w:w="55" w:type="dxa"/>
+              <w:start w:w="70" w:type="dxa"/>
+              <w:bottom w:w="55" w:type="dxa"/>
+              <w:end w:w="70" w:type="dxa"/>
+            </w:tcMar>
+          </w:tcPr>
+          <w:p>
+            <w:pPr>
+              <w:spacing w:before="0" w:after="0" w:line="240" w:lineRule="auto"/>
+            </w:pPr>
+            <w:r/>
+            <w:r>
+              <w:rPr>
+                <w:rFonts w:ascii="Aptos" w:hAnsi="Aptos"/>
+                <w:b w:val="0"/>
+                <w:color w:val="1F2937"/>
+                <w:sz w:val="14"/>
+              </w:rPr>
+              <w:t>Early stop at step 600 after two non-improving validations under the 0.005 min-delta rule; best checkpoint 400; no test/control rows used.</w:t>
             </w:r>
           </w:p>
         </w:tc>
@@ -2138,7 +2278,7 @@
         <w:rPr>
           <w:i w:val="0"/>
         </w:rPr>
-        <w:t>Gemma uses BF16 rank-4 LoRA, learning rate 1×10⁻⁴, assistant-response masking and a 1,024-token limit; the Muse clean run used four-bit rank-16 QLoRA, learning rate 2×10⁻⁴ and a 4,096-token limit. Next-token accuracy asks whether the model predicts the supplied next training token; it is not the percentage of policy questions answered correctly. Different model tokenizers and distinct training sizes forbid a numerical cross-family winner from those loss/accuracy columns. At N=509, validation loss worsened after epoch 2 while train fit improved; a resumed-run patience reset prevented the intended early-stop behavior. Select the best saved validation checkpoint, not the last checkpoint, for within-run analysis.</w:t>
+        <w:t>Gemma uses BF16 rank-4 LoRA, learning rate 1×10⁻⁴, assistant-response masking and a 1,024-token limit. Next-token accuracy measures prediction of supplied training tokens, not the percentage of policy questions answered correctly. Different tokenizers and training sizes forbid cross-family ranking from token-loss/accuracy columns; no answer-level validation accuracy is reported. N=509’s resumed callback lost its early-stop state and continued to step 320; its best saved validation checkpoint remains step 128. N=750 completed early stopping at step 376; checkpoint 188 has the best validation loss. N=1,600 completed at step 600; validation loss was best at step 400 (0.574997). The recorded evaluations at steps 400 and 600 were each less than a 0.005 improvement over the prior best, so the patience-2 callback requested stop. The final summary did not persist a stop-reason field; this classification is reconstructed from its validation history and the runner rule. Use the best validation checkpoint, not the final checkpoint, for within-run analysis.</w:t>
       </w:r>
     </w:p>
     <w:p>
@@ -2150,7 +2290,7 @@
         <w:rPr>
           <w:i w:val="0"/>
         </w:rPr>
-        <w:t>On the exposed 191-prompt historical generated set, Muse base versus Sep. 17: answer-token overlap F1 0.2076 versus 0.3973; numeric exact match 6.96% versus 17.39%; citation-URL presence 0% versus 24.08%. These are engineering diagnostics, NOT factual accuracy or verified source support. URL presence primarily shows learning the required output format. The predeclared 30-card human pilot is descriptive and may be optimistic because the generated answer key shares the Muse family; human/LLM rating agreement was not blinded. The formal promotion check returned pass=false because of truncation and a one-case abstention regression.</w:t>
+        <w:t>On the exposed 191-prompt historical generated set, untouched Muse versus the Sep. 17 adapter had answer-token overlap F1 0.2076 versus 0.3973, numeric exact match 6.96% versus 17.39%, and citation-URL presence 0% versus 24.08%. These are legacy engineering diagnostics—not factual accuracy or verified source support—and are not used for selection under the new matched protocol. URL presence mainly reflects output-format behavior. The separate predeclared 30-card human pilot is historical and descriptive; the generated answer key shares the Muse family and human/LLM rating agreement was not blinded. The old promotion check returned pass=false because of truncation and a one-case abstention regression.</w:t>
       </w:r>
     </w:p>
     <w:p>
@@ -2175,7 +2315,7 @@
         <w:rPr>
           <w:i w:val="0"/>
         </w:rPr>
-        <w:t>For continuation—not deployment—retain the Sep. 17 Muse adapter as the historical provisional condition, and continue the separately identified Gemma training-size experiment. The Sep. 17 pilot exceeds untouched Muse on the same thirty generated questions, but the difference cannot establish performance on realistic questions. Gemma improves the range of model choices yet lacks a comparable human-scored factual outcome. Nemotron and Ornith remain feasibility candidates. A definitive cross-family winner is withheld: the authorized train/validation measures are tokenizer-specific next-token metrics, and the protected control cannot be used to choose a winner after looking at its answers.</w:t>
+        <w:t>No candidate is selected or promoted. The September 17 and September 18 Muse adapters remain historical/non-comparable and are excluded from selection. Gemma N=1,600 completed; next implement the Muse-specific renderer and runner, then run Muse N=200/509/750/1,600 on the same nested train IDs and fixed validation before any matched model-only comparison. Token-level train/validation loss and accuracy support within-setup diagnostics but cannot rank the different tokenizers for factual generalization; the restricted answer-level validation metric is not reported. Nemotron and Ornith remain gated pending exact local memory/backward/checkpoint verification. The independent final test and student-authored control remain unspent; only after a candidate is independently chosen under the authorized criteria may the one-time test compare that winner against untouched base.</w:t>
       </w:r>
     </w:p>
     <w:p>
@@ -2369,7 +2509,7 @@
         <w:rPr>
           <w:i w:val="0"/>
         </w:rPr>
-        <w:t>The existing executed notebook rebuilds the historical 1,999-record ordinary dataset from the frozen candidates, verifies source hashes, reproduces the 1,684/124/191 split and earlier diagnostics from saved outputs. It does not reproduce new Gemma training or a not-yet-existent independent-control score. The local experiment manifests, run summaries and tested split-rendering scripts are listed in Appendix D; they must be incorporated into an executed, portable notebook before any new metric is represented as notebook-reproducible to the instructor. The public repo and notebook above are historical links, not a claim that this revision has been uploaded.</w:t>
+        <w:t>The linked executed notebook rebuilds the historical 1,999-record ordinary dataset, verifies source hashes, reproduces the 1,684/124/191 split, and replays earlier diagnostics. It does not reproduce the new Gemma N=200/509/750/1,600 training, the queued matched Muse series, or any final-control score. The linked public repository hosts the identity-protected J.O. copy of this supplement. The local experiment manifests, run summaries and tested split-rendering scripts are listed in Appendix D; before new metrics are called notebook-reproducible, those artifacts must be incorporated into an executed, portable notebook.</w:t>
       </w:r>
     </w:p>
     <w:p>
@@ -2852,7 +2992,7 @@
         <w:rPr>
           <w:i w:val="0"/>
         </w:rPr>
-        <w:t>AI assistance. Hermes Agent (GPT-6 Sol 900k) reviewed the professor’s feedback, rubric, saved project evidence and document layout; wrote and validated this supplement and its build code. Earlier local Muse generated the original SFT candidates. AI-suggested leakage categories and document prose are not human source adjudication, independently authored control questions, or model outcomes.</w:t>
+        <w:t>AI assistance. Hermes Agent (GPT-6 Sol 900k for the initial post-feedback review and GPT-6 Luna 900k for this update) reviewed the professor’s feedback, rubric, saved project evidence and document layout; drafted and validated this supplement and its build code. Earlier local Muse generated the original SFT candidates. AI-suggested leakage categories and document prose are not human source adjudication, independently authored control questions, or model outcomes.</w:t>
       </w:r>
     </w:p>
     <w:p>
@@ -2876,7 +3016,7 @@
         <w:rPr>
           <w:i w:val="0"/>
         </w:rPr>
-        <w:t>Verification. The builder reads fixed local evidence, asserts the clean dataset hash, the 30 historical test-document mappings and the 16-group/57-record duplicate count, and checks new Gemma summary identities. DOCX package validation, PDF text readback and page-level visual review are delivery checks, not substitutes for human adjudication.</w:t>
+        <w:t>Verification. The builder asserts the clean dataset hash, the 30 historical test-document mappings, the 16-group/57-record duplicate count, Gemma N=750 completion at step376, and Gemma N=1,600 completion at step600 with best checkpoint400. DOCX package validation, PDF text readback and page-level visual review are delivery checks, not substitutes for human adjudication.</w:t>
       </w:r>
     </w:p>
     <w:p>
@@ -9954,7 +10094,7 @@
                 <w:color w:val="1F2937"/>
                 <w:sz w:val="15"/>
               </w:rPr>
-              <w:t>Gemma N=200 and N=509 actual results</w:t>
+              <w:t>Gemma N=200, N=509, and N=750 results</w:t>
             </w:r>
           </w:p>
         </w:tc>
@@ -9982,7 +10122,7 @@
                 <w:color w:val="1F2937"/>
                 <w:sz w:val="15"/>
               </w:rPr>
-              <w:t>artifacts/model_comparison/2026-09-25/training_results/gemma4-{n200-training-summary,n509-resumed-training-summary}.json; results.jsonl; run_log.csv</w:t>
+              <w:t>artifacts/model_comparison/2026-09-25/training_results/gemma4-{n200-training-summary,n509-resumed-training-summary,n750-final-training-summary}.json; results.jsonl; run_log.csv</w:t>
             </w:r>
           </w:p>
         </w:tc>
@@ -10014,7 +10154,7 @@
                 <w:color w:val="1F2937"/>
                 <w:sz w:val="15"/>
               </w:rPr>
-              <w:t>N=750 provisional checkpoint and untouched final control</w:t>
+              <w:t>Gemma N=1,600 completed run and best checkpoint</w:t>
             </w:r>
           </w:p>
         </w:tc>
@@ -10041,7 +10181,127 @@
                 <w:color w:val="1F2937"/>
                 <w:sz w:val="15"/>
               </w:rPr>
-              <w:t>artifacts/model_comparison/2026-09-25/training_results/gemma4-n750-checkpoint188-trainer-state.json; N=750 live read-only observation at 2026-09-28 13:15 CDT; no final control scores</w:t>
+              <w:t>Final step600 checkpoint and completion record are copied locally and SHA-256 verified against amaailab1; checkpoint400 remains best validation loss. See training_results/gemma4-n1600-checkpoint600/, gemma4-n1600-checkpoint600.sha256, gemma4-n1600-completion-record/{training_summary,trainer_state,run_config}.json; results.jsonl and run_log.csv. Trainer finished 2026-09-28 15:42 CT, exit0/no OOM; no test/control rows used.</w:t>
+            </w:r>
+          </w:p>
+        </w:tc>
+      </w:tr>
+      <w:tr>
+        <w:trPr>
+          <w:cantSplit/>
+        </w:trPr>
+        <w:tc>
+          <w:tcPr>
+            <w:tcW w:type="dxa" w:w="3053"/>
+            <w:vAlign w:val="center"/>
+            <w:tcMar>
+              <w:top w:w="55" w:type="dxa"/>
+              <w:start w:w="70" w:type="dxa"/>
+              <w:bottom w:w="55" w:type="dxa"/>
+              <w:end w:w="70" w:type="dxa"/>
+            </w:tcMar>
+            <w:shd w:fill="F6F8FB"/>
+          </w:tcPr>
+          <w:p>
+            <w:pPr>
+              <w:spacing w:before="0" w:after="0" w:line="240" w:lineRule="auto"/>
+            </w:pPr>
+            <w:r/>
+            <w:r>
+              <w:rPr>
+                <w:rFonts w:ascii="Aptos" w:hAnsi="Aptos"/>
+                <w:b w:val="0"/>
+                <w:color w:val="1F2937"/>
+                <w:sz w:val="15"/>
+              </w:rPr>
+              <w:t>Muse methodology change and legacy boundary</w:t>
+            </w:r>
+          </w:p>
+        </w:tc>
+        <w:tc>
+          <w:tcPr>
+            <w:tcW w:type="dxa" w:w="7603"/>
+            <w:vAlign w:val="center"/>
+            <w:tcMar>
+              <w:top w:w="55" w:type="dxa"/>
+              <w:start w:w="70" w:type="dxa"/>
+              <w:bottom w:w="55" w:type="dxa"/>
+              <w:end w:w="70" w:type="dxa"/>
+            </w:tcMar>
+            <w:shd w:fill="F6F8FB"/>
+          </w:tcPr>
+          <w:p>
+            <w:pPr>
+              <w:spacing w:before="0" w:after="0" w:line="240" w:lineRule="auto"/>
+            </w:pPr>
+            <w:r/>
+            <w:r>
+              <w:rPr>
+                <w:rFonts w:ascii="Aptos" w:hAnsi="Aptos"/>
+                <w:b w:val="0"/>
+                <w:color w:val="1F2937"/>
+                <w:sz w:val="15"/>
+              </w:rPr>
+              <w:t>docs/plans/2026-09-28-muse-retraining-methodology-amendment.md; artifacts/model_comparison/2026-09-25/legacy-muse-comparability-note.json; fresh matched Muse series queued after Gemma N=1,600; not started.</w:t>
+            </w:r>
+          </w:p>
+        </w:tc>
+      </w:tr>
+      <w:tr>
+        <w:trPr>
+          <w:cantSplit/>
+        </w:trPr>
+        <w:tc>
+          <w:tcPr>
+            <w:tcW w:type="dxa" w:w="3053"/>
+            <w:vAlign w:val="center"/>
+            <w:tcMar>
+              <w:top w:w="55" w:type="dxa"/>
+              <w:start w:w="70" w:type="dxa"/>
+              <w:bottom w:w="55" w:type="dxa"/>
+              <w:end w:w="70" w:type="dxa"/>
+            </w:tcMar>
+          </w:tcPr>
+          <w:p>
+            <w:pPr>
+              <w:spacing w:before="0" w:after="0" w:line="240" w:lineRule="auto"/>
+            </w:pPr>
+            <w:r/>
+            <w:r>
+              <w:rPr>
+                <w:rFonts w:ascii="Aptos" w:hAnsi="Aptos"/>
+                <w:b w:val="0"/>
+                <w:color w:val="1F2937"/>
+                <w:sz w:val="15"/>
+              </w:rPr>
+              <w:t>Nemotron/Ornith architecture-family review</w:t>
+            </w:r>
+          </w:p>
+        </w:tc>
+        <w:tc>
+          <w:tcPr>
+            <w:tcW w:type="dxa" w:w="7603"/>
+            <w:vAlign w:val="center"/>
+            <w:tcMar>
+              <w:top w:w="55" w:type="dxa"/>
+              <w:start w:w="70" w:type="dxa"/>
+              <w:bottom w:w="55" w:type="dxa"/>
+              <w:end w:w="70" w:type="dxa"/>
+            </w:tcMar>
+          </w:tcPr>
+          <w:p>
+            <w:pPr>
+              <w:spacing w:before="0" w:after="0" w:line="240" w:lineRule="auto"/>
+            </w:pPr>
+            <w:r/>
+            <w:r>
+              <w:rPr>
+                <w:rFonts w:ascii="Aptos" w:hAnsi="Aptos"/>
+                <w:b w:val="0"/>
+                <w:color w:val="1F2937"/>
+                <w:sz w:val="15"/>
+              </w:rPr>
+              <w:t>artifacts/model_comparison/2026-09-25/architecture_backward_gate_review_2026-09-28.json; official sources recorded there; exact local backward/memory/checkpoint gates remain open.</w:t>
             </w:r>
           </w:p>
         </w:tc>

</xml_diff>

<commit_message>
docs: refresh public milestone 1 v3 with completed Muse sweep
</commit_message>
<xml_diff>
--- a/docs/J_O_INAI6986_Milestone1_v3.docx
+++ b/docs/J_O_INAI6986_Milestone1_v3.docx
@@ -36,7 +36,7 @@
         <w:rPr>
           <w:i w:val="0"/>
         </w:rPr>
-        <w:t>J.O.  •  Dr. David M. Simmonds  •  Evidence through September 28, 2026, 3:42 PM CDT</w:t>
+        <w:t>J.O.  •  Dr. David M. Simmonds  •  Evidence through September 30, 2026, 11:30 AM CDT</w:t>
       </w:r>
     </w:p>
     <w:tbl>
@@ -85,7 +85,7 @@
                 <w:color w:val="1F2937"/>
                 <w:sz w:val="18"/>
               </w:rPr>
-              <w:t>The original September 24 evidence remains historical; later work below is a post-feedback supplement, not evidence that it was available at the original deadline. September 17/18 Muse runs are preserved as historical legacy experiments only; they do not use the new nested split-controlled protocol and are excluded from candidate selection. Gemma training/validation metrics are token-level fit diagnostics, not factual-accuracy comparisons. At the reporting cutoff, Gemma N=1,600 completed at step600/epoch3; checkpoint400 remains its best validation-loss checkpoint. A matched Muse sweep is next. No model has been promoted, and the independent final control/test remain unspent.</w:t>
+              <w:t>The original September 24 evidence remains historical; later work is a post-feedback supplement, not evidence available at the original deadline. September 17/18 Muse runs remain legacy/non-comparable. Both new Gemma and Muse series completed nested N=200/509/750/1,600 training on shared prompt IDs and fixed validation; their tokenizer-specific fit metrics cannot rank factual answers across families. No model has been promoted. The protected final control/test remain unspent; human leakage review and a reasoning/abstention control remain open.</w:t>
             </w:r>
           </w:p>
         </w:tc>
@@ -705,7 +705,7 @@
                 <w:color w:val="1F2937"/>
                 <w:sz w:val="15"/>
               </w:rPr>
-              <w:t>Legacy four-bit baseline; adapters and historical outputs are preserved for provenance, not reused as matched candidates.</w:t>
+              <w:t>Four-bit local baseline; legacy adapters and outputs preserved separately; new target-specific render and recipe (rank 16, LR 2×10⁻⁴).</w:t>
             </w:r>
           </w:p>
         </w:tc>
@@ -732,7 +732,7 @@
                 <w:color w:val="1F2937"/>
                 <w:sz w:val="15"/>
               </w:rPr>
-              <w:t>Sep. 17 clean run and Sep. 18 different-render sensitivity run are historical/non-comparable; excluded from selection. Fresh Muse N=200/509/750/1,600 series is queued after Gemma N=1,600.</w:t>
+              <w:t>Fresh N=200/509/750/1,600 series completed Sep. 29–30 on the same nested prompt IDs and 124 validation IDs as Gemma. Historical Sep. 17/18 runs remain non-comparable.</w:t>
             </w:r>
           </w:p>
         </w:tc>
@@ -2259,6 +2259,151 @@
                 <w:sz w:val="14"/>
               </w:rPr>
               <w:t>Early stop at step 600 after two non-improving validations under the 0.005 min-delta rule; best checkpoint 400; no test/control rows used.</w:t>
+            </w:r>
+          </w:p>
+        </w:tc>
+      </w:tr>
+      <w:tr>
+        <w:trPr>
+          <w:cantSplit/>
+        </w:trPr>
+        <w:tc>
+          <w:tcPr>
+            <w:tcW w:type="dxa" w:w="2232"/>
+            <w:vAlign w:val="center"/>
+            <w:tcMar>
+              <w:top w:w="55" w:type="dxa"/>
+              <w:start w:w="70" w:type="dxa"/>
+              <w:bottom w:w="55" w:type="dxa"/>
+              <w:end w:w="70" w:type="dxa"/>
+            </w:tcMar>
+            <w:shd w:fill="F6F8FB"/>
+          </w:tcPr>
+          <w:p>
+            <w:pPr>
+              <w:spacing w:before="0" w:after="0" w:line="240" w:lineRule="auto"/>
+            </w:pPr>
+            <w:r/>
+            <w:r>
+              <w:rPr>
+                <w:rFonts w:ascii="Aptos" w:hAnsi="Aptos"/>
+                <w:b w:val="0"/>
+                <w:color w:val="1F2937"/>
+                <w:sz w:val="14"/>
+              </w:rPr>
+              <w:t>Fresh Muse, N=200/509/750/1,600</w:t>
+            </w:r>
+          </w:p>
+        </w:tc>
+        <w:tc>
+          <w:tcPr>
+            <w:tcW w:type="dxa" w:w="1512"/>
+            <w:vAlign w:val="center"/>
+            <w:tcMar>
+              <w:top w:w="55" w:type="dxa"/>
+              <w:start w:w="70" w:type="dxa"/>
+              <w:bottom w:w="55" w:type="dxa"/>
+              <w:end w:w="70" w:type="dxa"/>
+            </w:tcMar>
+            <w:shd w:fill="F6F8FB"/>
+          </w:tcPr>
+          <w:p>
+            <w:pPr>
+              <w:spacing w:before="0" w:after="0" w:line="240" w:lineRule="auto"/>
+            </w:pPr>
+            <w:r/>
+            <w:r>
+              <w:rPr>
+                <w:rFonts w:ascii="Aptos" w:hAnsi="Aptos"/>
+                <w:b w:val="0"/>
+                <w:color w:val="1F2937"/>
+                <w:sz w:val="14"/>
+              </w:rPr>
+              <w:t>Not scored</w:t>
+            </w:r>
+          </w:p>
+        </w:tc>
+        <w:tc>
+          <w:tcPr>
+            <w:tcW w:type="dxa" w:w="2520"/>
+            <w:vAlign w:val="center"/>
+            <w:tcMar>
+              <w:top w:w="55" w:type="dxa"/>
+              <w:start w:w="70" w:type="dxa"/>
+              <w:bottom w:w="55" w:type="dxa"/>
+              <w:end w:w="70" w:type="dxa"/>
+            </w:tcMar>
+            <w:shd w:fill="F6F8FB"/>
+          </w:tcPr>
+          <w:p>
+            <w:pPr>
+              <w:spacing w:before="0" w:after="0" w:line="240" w:lineRule="auto"/>
+            </w:pPr>
+            <w:r/>
+            <w:r>
+              <w:rPr>
+                <w:rFonts w:ascii="Aptos" w:hAnsi="Aptos"/>
+                <w:b w:val="0"/>
+                <w:color w:val="1F2937"/>
+                <w:sz w:val="14"/>
+              </w:rPr>
+              <w:t>Token-level training completed; see Appendix E</w:t>
+            </w:r>
+          </w:p>
+        </w:tc>
+        <w:tc>
+          <w:tcPr>
+            <w:tcW w:type="dxa" w:w="2592"/>
+            <w:vAlign w:val="center"/>
+            <w:tcMar>
+              <w:top w:w="55" w:type="dxa"/>
+              <w:start w:w="70" w:type="dxa"/>
+              <w:bottom w:w="55" w:type="dxa"/>
+              <w:end w:w="70" w:type="dxa"/>
+            </w:tcMar>
+            <w:shd w:fill="F6F8FB"/>
+          </w:tcPr>
+          <w:p>
+            <w:pPr>
+              <w:spacing w:before="0" w:after="0" w:line="240" w:lineRule="auto"/>
+            </w:pPr>
+            <w:r/>
+            <w:r>
+              <w:rPr>
+                <w:rFonts w:ascii="Aptos" w:hAnsi="Aptos"/>
+                <w:b w:val="0"/>
+                <w:color w:val="1F2937"/>
+                <w:sz w:val="14"/>
+              </w:rPr>
+              <w:t>Same 124 validation IDs; see Appendix E</w:t>
+            </w:r>
+          </w:p>
+        </w:tc>
+        <w:tc>
+          <w:tcPr>
+            <w:tcW w:type="dxa" w:w="1800"/>
+            <w:vAlign w:val="center"/>
+            <w:tcMar>
+              <w:top w:w="55" w:type="dxa"/>
+              <w:start w:w="70" w:type="dxa"/>
+              <w:bottom w:w="55" w:type="dxa"/>
+              <w:end w:w="70" w:type="dxa"/>
+            </w:tcMar>
+            <w:shd w:fill="F6F8FB"/>
+          </w:tcPr>
+          <w:p>
+            <w:pPr>
+              <w:spacing w:before="0" w:after="0" w:line="240" w:lineRule="auto"/>
+            </w:pPr>
+            <w:r/>
+            <w:r>
+              <w:rPr>
+                <w:rFonts w:ascii="Aptos" w:hAnsi="Aptos"/>
+                <w:b w:val="0"/>
+                <w:color w:val="1F2937"/>
+                <w:sz w:val="14"/>
+              </w:rPr>
+              <w:t>Four completed new runs, separate from Sep. 17/18 legacy Muse; no final test/control used.</w:t>
             </w:r>
           </w:p>
         </w:tc>
@@ -2315,7 +2460,7 @@
         <w:rPr>
           <w:i w:val="0"/>
         </w:rPr>
-        <w:t>No candidate is selected or promoted. The September 17 and September 18 Muse adapters remain historical/non-comparable and are excluded from selection. Gemma N=1,600 completed; next implement the Muse-specific renderer and runner, then run Muse N=200/509/750/1,600 on the same nested train IDs and fixed validation before any matched model-only comparison. Token-level train/validation loss and accuracy support within-setup diagnostics but cannot rank the different tokenizers for factual generalization; the restricted answer-level validation metric is not reported. Nemotron and Ornith remain gated pending exact local memory/backward/checkpoint verification. The independent final test and student-authored control remain unspent; only after a candidate is independently chosen under the authorized criteria may the one-time test compare that winner against untouched base.</w:t>
+        <w:t>No candidate is selected or promoted. The Sep. 17/18 Muse adapters remain historical/non-comparable. New Muse and Gemma sweeps now share nested training prompt IDs and fixed validation IDs, but model-specific tokenization, renderers and recipes mean token loss and next-token accuracy are within-model diagnostics, not cross-family factual-answer rankings. A human-adjudicated answer-level comparison has not been authorized on validation and has not occurred; do not substitute the protected test or control to choose a winner. At the cutoff, Nemotron and Ornith still have no project-data training results and require exact local training gates. Only after an independently defensible candidate selection, dataset lock and human leakage disposition can the one-time final evaluation compare it against untouched base.</w:t>
       </w:r>
     </w:p>
     <w:p>
@@ -2509,7 +2654,7 @@
         <w:rPr>
           <w:i w:val="0"/>
         </w:rPr>
-        <w:t>The linked executed notebook rebuilds the historical 1,999-record ordinary dataset, verifies source hashes, reproduces the 1,684/124/191 split, and replays earlier diagnostics. It does not reproduce the new Gemma N=200/509/750/1,600 training, the queued matched Muse series, or any final-control score. The linked public repository hosts the identity-protected J.O. copy of this supplement. The local experiment manifests, run summaries and tested split-rendering scripts are listed in Appendix D; before new metrics are called notebook-reproducible, those artifacts must be incorporated into an executed, portable notebook.</w:t>
+        <w:t>The linked executed notebook rebuilds the historical 1,999-record dataset, checks source hashes and the 1,684/124/191 split, and replays legacy diagnostics. It does not rerun either new training series or any final-control score. The linked public repository hosts the identity-protected J.O. copy. Local manifests, summaries and tested renderers are identified in Appendices D/E; the new runs are not yet reproduced by an executed portable notebook.</w:t>
       </w:r>
     </w:p>
     <w:p>
@@ -2992,7 +3137,7 @@
         <w:rPr>
           <w:i w:val="0"/>
         </w:rPr>
-        <w:t>AI assistance. Hermes Agent (GPT-6 Sol 900k for the initial post-feedback review and GPT-6 Luna 900k for this update) reviewed the professor’s feedback, rubric, saved project evidence and document layout; drafted and validated this supplement and its build code. Earlier local Muse generated the original SFT candidates. AI-suggested leakage categories and document prose are not human source adjudication, independently authored control questions, or model outcomes.</w:t>
+        <w:t>AI assistance. Hermes Agent (GPT-6 Sol 900k for the initial review and September 30 evidence refresh; GPT-6 Luna 900k for the earlier update) reviewed the professor’s feedback, rubric, saved project evidence and document layout; drafted and validated this supplement and its build code. Earlier local Muse generated original SFT candidates. AI-suggested leakage categories and document prose are not human source adjudication, independently authored control questions, or model outcomes.</w:t>
       </w:r>
     </w:p>
     <w:p>
@@ -3016,7 +3161,7 @@
         <w:rPr>
           <w:i w:val="0"/>
         </w:rPr>
-        <w:t>Verification. The builder asserts the clean dataset hash, the 30 historical test-document mappings, the 16-group/57-record duplicate count, Gemma N=750 completion at step376, and Gemma N=1,600 completion at step600 with best checkpoint400. DOCX package validation, PDF text readback and page-level visual review are delivery checks, not substitutes for human adjudication.</w:t>
+        <w:t>Verification. The builder asserts the clean dataset hash, all 30 historical test-document mappings, the 16-group/57-record duplicate count, Gemma N=750 and N=1,600 completion, and four new Muse completions on matched train/validation prompt IDs with zero test/control rows. DOCX/PDF checks are delivery checks, not human adjudication.</w:t>
       </w:r>
     </w:p>
     <w:p>
@@ -10214,7 +10359,7 @@
                 <w:color w:val="1F2937"/>
                 <w:sz w:val="15"/>
               </w:rPr>
-              <w:t>Muse methodology change and legacy boundary</w:t>
+              <w:t>Muse methodology and completed new series</w:t>
             </w:r>
           </w:p>
         </w:tc>
@@ -10242,7 +10387,7 @@
                 <w:color w:val="1F2937"/>
                 <w:sz w:val="15"/>
               </w:rPr>
-              <w:t>docs/plans/2026-09-28-muse-retraining-methodology-amendment.md; artifacts/model_comparison/2026-09-25/legacy-muse-comparability-note.json; fresh matched Muse series queued after Gemma N=1,600; not started.</w:t>
+              <w:t>docs/plans/2026-09-28-muse-retraining-methodology-amendment.md (historical plan); artifacts/model_comparison/2026-09-25/legacy-muse-comparability-note.json; muse-runs/muse-glimmer-n{200,509,750}-20260929/ and muse-glimmer-n1600-20260929-completion-20260930/; results.jsonl; Appendix E. All four new runs completed; legacy runs not pooled.</w:t>
             </w:r>
           </w:p>
         </w:tc>
@@ -10354,6 +10499,639 @@
           <w:i w:val="0"/>
         </w:rPr>
         <w:t>LoRA method: Hu et al., https://arxiv.org/abs/2106.09685. Candidate model identities and exact pinned revisions are recorded in artifacts/model_comparison/2026-09-25/source-state-inventory.json; no third-party performance claim is inferred from a model card.</w:t>
+      </w:r>
+    </w:p>
+    <w:p>
+      <w:r>
+        <w:br w:type="page"/>
+      </w:r>
+    </w:p>
+    <w:p>
+      <w:pPr>
+        <w:pStyle w:val="Heading1"/>
+      </w:pPr>
+      <w:r>
+        <w:t>Appendix E — New Matched Muse Series (September 29–30)</w:t>
+      </w:r>
+    </w:p>
+    <w:p>
+      <w:pPr>
+        <w:keepLines w:val="0"/>
+        <w:widowControl/>
+      </w:pPr>
+      <w:r>
+        <w:rPr>
+          <w:i w:val="0"/>
+        </w:rPr>
+        <w:t>These are new split-controlled project-data training runs, not the September 17/18 legacy pilots. Each size uses the exact Gemma train prompt IDs at that size and the same 124 validation IDs; target-specific Muse rendering produces different token sequences and file hashes. The pinned Muse four-bit base uses rank-16 LoRA, learning rate 2×10⁻⁴, BF16 compute, assistant-response masking, a 1,024-token limit and seed 20260925. Gemma instead used rank 4 and learning rate 1×10⁻⁴. All rows below are teacher-forced next-token fit diagnostics, never human-graded policy-answer accuracy; each used zero protected test/control rows.</w:t>
+      </w:r>
+    </w:p>
+    <w:tbl>
+      <w:tblPr>
+        <w:tblStyle w:val="TableGrid"/>
+        <w:tblW w:type="auto" w:w="0"/>
+        <w:tblLayout w:type="fixed"/>
+        <w:tblLook w:firstColumn="1" w:firstRow="1" w:lastColumn="0" w:lastRow="0" w:noHBand="0" w:noVBand="1" w:val="04A0"/>
+      </w:tblPr>
+      <w:tblGrid>
+        <w:gridCol w:w="2541"/>
+        <w:gridCol w:w="2541"/>
+        <w:gridCol w:w="2541"/>
+        <w:gridCol w:w="2541"/>
+      </w:tblGrid>
+      <w:tr>
+        <w:trPr>
+          <w:tblHeader w:val="true"/>
+        </w:trPr>
+        <w:tc>
+          <w:tcPr>
+            <w:tcW w:type="dxa" w:w="1872"/>
+            <w:vAlign w:val="center"/>
+            <w:tcMar>
+              <w:top w:w="55" w:type="dxa"/>
+              <w:start w:w="70" w:type="dxa"/>
+              <w:bottom w:w="55" w:type="dxa"/>
+              <w:end w:w="70" w:type="dxa"/>
+            </w:tcMar>
+            <w:shd w:fill="32528B"/>
+          </w:tcPr>
+          <w:p>
+            <w:pPr>
+              <w:spacing w:before="0" w:after="0" w:line="240" w:lineRule="auto"/>
+            </w:pPr>
+            <w:r/>
+            <w:r>
+              <w:rPr>
+                <w:rFonts w:ascii="Aptos" w:hAnsi="Aptos"/>
+                <w:b/>
+                <w:color w:val="FFFFFF"/>
+                <w:sz w:val="15"/>
+              </w:rPr>
+              <w:t>New Muse Run</w:t>
+            </w:r>
+          </w:p>
+        </w:tc>
+        <w:tc>
+          <w:tcPr>
+            <w:tcW w:type="dxa" w:w="2736"/>
+            <w:vAlign w:val="center"/>
+            <w:tcMar>
+              <w:top w:w="55" w:type="dxa"/>
+              <w:start w:w="70" w:type="dxa"/>
+              <w:bottom w:w="55" w:type="dxa"/>
+              <w:end w:w="70" w:type="dxa"/>
+            </w:tcMar>
+            <w:shd w:fill="32528B"/>
+          </w:tcPr>
+          <w:p>
+            <w:pPr>
+              <w:spacing w:before="0" w:after="0" w:line="240" w:lineRule="auto"/>
+            </w:pPr>
+            <w:r/>
+            <w:r>
+              <w:rPr>
+                <w:rFonts w:ascii="Aptos" w:hAnsi="Aptos"/>
+                <w:b/>
+                <w:color w:val="FFFFFF"/>
+                <w:sz w:val="15"/>
+              </w:rPr>
+              <w:t>Final Train Fit (loss / accuracy)</w:t>
+            </w:r>
+          </w:p>
+        </w:tc>
+        <w:tc>
+          <w:tcPr>
+            <w:tcW w:type="dxa" w:w="2952"/>
+            <w:vAlign w:val="center"/>
+            <w:tcMar>
+              <w:top w:w="55" w:type="dxa"/>
+              <w:start w:w="70" w:type="dxa"/>
+              <w:bottom w:w="55" w:type="dxa"/>
+              <w:end w:w="70" w:type="dxa"/>
+            </w:tcMar>
+            <w:shd w:fill="32528B"/>
+          </w:tcPr>
+          <w:p>
+            <w:pPr>
+              <w:spacing w:before="0" w:after="0" w:line="240" w:lineRule="auto"/>
+            </w:pPr>
+            <w:r/>
+            <w:r>
+              <w:rPr>
+                <w:rFonts w:ascii="Aptos" w:hAnsi="Aptos"/>
+                <w:b/>
+                <w:color w:val="FFFFFF"/>
+                <w:sz w:val="15"/>
+              </w:rPr>
+              <w:t>Final Validation Fit (loss / accuracy)</w:t>
+            </w:r>
+          </w:p>
+        </w:tc>
+        <w:tc>
+          <w:tcPr>
+            <w:tcW w:type="dxa" w:w="3096"/>
+            <w:vAlign w:val="center"/>
+            <w:tcMar>
+              <w:top w:w="55" w:type="dxa"/>
+              <w:start w:w="70" w:type="dxa"/>
+              <w:bottom w:w="55" w:type="dxa"/>
+              <w:end w:w="70" w:type="dxa"/>
+            </w:tcMar>
+            <w:shd w:fill="32528B"/>
+          </w:tcPr>
+          <w:p>
+            <w:pPr>
+              <w:spacing w:before="0" w:after="0" w:line="240" w:lineRule="auto"/>
+            </w:pPr>
+            <w:r/>
+            <w:r>
+              <w:rPr>
+                <w:rFonts w:ascii="Aptos" w:hAnsi="Aptos"/>
+                <w:b/>
+                <w:color w:val="FFFFFF"/>
+                <w:sz w:val="15"/>
+              </w:rPr>
+              <w:t>Best Validation Checkpoint / Loss</w:t>
+            </w:r>
+          </w:p>
+        </w:tc>
+      </w:tr>
+      <w:tr>
+        <w:trPr>
+          <w:cantSplit/>
+        </w:trPr>
+        <w:tc>
+          <w:tcPr>
+            <w:tcW w:type="dxa" w:w="1872"/>
+            <w:vAlign w:val="center"/>
+            <w:tcMar>
+              <w:top w:w="55" w:type="dxa"/>
+              <w:start w:w="70" w:type="dxa"/>
+              <w:bottom w:w="55" w:type="dxa"/>
+              <w:end w:w="70" w:type="dxa"/>
+            </w:tcMar>
+          </w:tcPr>
+          <w:p>
+            <w:pPr>
+              <w:spacing w:before="0" w:after="0" w:line="240" w:lineRule="auto"/>
+            </w:pPr>
+            <w:r/>
+            <w:r>
+              <w:rPr>
+                <w:rFonts w:ascii="Aptos" w:hAnsi="Aptos"/>
+                <w:b w:val="0"/>
+                <w:color w:val="1F2937"/>
+                <w:sz w:val="15"/>
+              </w:rPr>
+              <w:t>N=200; final step 75</w:t>
+            </w:r>
+          </w:p>
+        </w:tc>
+        <w:tc>
+          <w:tcPr>
+            <w:tcW w:type="dxa" w:w="2736"/>
+            <w:vAlign w:val="center"/>
+            <w:tcMar>
+              <w:top w:w="55" w:type="dxa"/>
+              <w:start w:w="70" w:type="dxa"/>
+              <w:bottom w:w="55" w:type="dxa"/>
+              <w:end w:w="70" w:type="dxa"/>
+            </w:tcMar>
+          </w:tcPr>
+          <w:p>
+            <w:pPr>
+              <w:spacing w:before="0" w:after="0" w:line="240" w:lineRule="auto"/>
+            </w:pPr>
+            <w:r/>
+            <w:r>
+              <w:rPr>
+                <w:rFonts w:ascii="Aptos" w:hAnsi="Aptos"/>
+                <w:b w:val="0"/>
+                <w:color w:val="1F2937"/>
+                <w:sz w:val="15"/>
+              </w:rPr>
+              <w:t>0.2376 / 93.15%</w:t>
+            </w:r>
+          </w:p>
+        </w:tc>
+        <w:tc>
+          <w:tcPr>
+            <w:tcW w:type="dxa" w:w="2952"/>
+            <w:vAlign w:val="center"/>
+            <w:tcMar>
+              <w:top w:w="55" w:type="dxa"/>
+              <w:start w:w="70" w:type="dxa"/>
+              <w:bottom w:w="55" w:type="dxa"/>
+              <w:end w:w="70" w:type="dxa"/>
+            </w:tcMar>
+          </w:tcPr>
+          <w:p>
+            <w:pPr>
+              <w:spacing w:before="0" w:after="0" w:line="240" w:lineRule="auto"/>
+            </w:pPr>
+            <w:r/>
+            <w:r>
+              <w:rPr>
+                <w:rFonts w:ascii="Aptos" w:hAnsi="Aptos"/>
+                <w:b w:val="0"/>
+                <w:color w:val="1F2937"/>
+                <w:sz w:val="15"/>
+              </w:rPr>
+              <w:t>0.6589 / 84.54%</w:t>
+            </w:r>
+          </w:p>
+        </w:tc>
+        <w:tc>
+          <w:tcPr>
+            <w:tcW w:type="dxa" w:w="3096"/>
+            <w:vAlign w:val="center"/>
+            <w:tcMar>
+              <w:top w:w="55" w:type="dxa"/>
+              <w:start w:w="70" w:type="dxa"/>
+              <w:bottom w:w="55" w:type="dxa"/>
+              <w:end w:w="70" w:type="dxa"/>
+            </w:tcMar>
+          </w:tcPr>
+          <w:p>
+            <w:pPr>
+              <w:spacing w:before="0" w:after="0" w:line="240" w:lineRule="auto"/>
+            </w:pPr>
+            <w:r/>
+            <w:r>
+              <w:rPr>
+                <w:rFonts w:ascii="Aptos" w:hAnsi="Aptos"/>
+                <w:b w:val="0"/>
+                <w:color w:val="1F2937"/>
+                <w:sz w:val="15"/>
+              </w:rPr>
+              <w:t>step 25; 0.5853</w:t>
+            </w:r>
+          </w:p>
+        </w:tc>
+      </w:tr>
+      <w:tr>
+        <w:trPr>
+          <w:cantSplit/>
+        </w:trPr>
+        <w:tc>
+          <w:tcPr>
+            <w:tcW w:type="dxa" w:w="1872"/>
+            <w:vAlign w:val="center"/>
+            <w:tcMar>
+              <w:top w:w="55" w:type="dxa"/>
+              <w:start w:w="70" w:type="dxa"/>
+              <w:bottom w:w="55" w:type="dxa"/>
+              <w:end w:w="70" w:type="dxa"/>
+            </w:tcMar>
+            <w:shd w:fill="F6F8FB"/>
+          </w:tcPr>
+          <w:p>
+            <w:pPr>
+              <w:spacing w:before="0" w:after="0" w:line="240" w:lineRule="auto"/>
+            </w:pPr>
+            <w:r/>
+            <w:r>
+              <w:rPr>
+                <w:rFonts w:ascii="Aptos" w:hAnsi="Aptos"/>
+                <w:b w:val="0"/>
+                <w:color w:val="1F2937"/>
+                <w:sz w:val="15"/>
+              </w:rPr>
+              <w:t>N=509; final step 192</w:t>
+            </w:r>
+          </w:p>
+        </w:tc>
+        <w:tc>
+          <w:tcPr>
+            <w:tcW w:type="dxa" w:w="2736"/>
+            <w:vAlign w:val="center"/>
+            <w:tcMar>
+              <w:top w:w="55" w:type="dxa"/>
+              <w:start w:w="70" w:type="dxa"/>
+              <w:bottom w:w="55" w:type="dxa"/>
+              <w:end w:w="70" w:type="dxa"/>
+            </w:tcMar>
+            <w:shd w:fill="F6F8FB"/>
+          </w:tcPr>
+          <w:p>
+            <w:pPr>
+              <w:spacing w:before="0" w:after="0" w:line="240" w:lineRule="auto"/>
+            </w:pPr>
+            <w:r/>
+            <w:r>
+              <w:rPr>
+                <w:rFonts w:ascii="Aptos" w:hAnsi="Aptos"/>
+                <w:b w:val="0"/>
+                <w:color w:val="1F2937"/>
+                <w:sz w:val="15"/>
+              </w:rPr>
+              <w:t>0.0856 / 97.64%</w:t>
+            </w:r>
+          </w:p>
+        </w:tc>
+        <w:tc>
+          <w:tcPr>
+            <w:tcW w:type="dxa" w:w="2952"/>
+            <w:vAlign w:val="center"/>
+            <w:tcMar>
+              <w:top w:w="55" w:type="dxa"/>
+              <w:start w:w="70" w:type="dxa"/>
+              <w:bottom w:w="55" w:type="dxa"/>
+              <w:end w:w="70" w:type="dxa"/>
+            </w:tcMar>
+            <w:shd w:fill="F6F8FB"/>
+          </w:tcPr>
+          <w:p>
+            <w:pPr>
+              <w:spacing w:before="0" w:after="0" w:line="240" w:lineRule="auto"/>
+            </w:pPr>
+            <w:r/>
+            <w:r>
+              <w:rPr>
+                <w:rFonts w:ascii="Aptos" w:hAnsi="Aptos"/>
+                <w:b w:val="0"/>
+                <w:color w:val="1F2937"/>
+                <w:sz w:val="15"/>
+              </w:rPr>
+              <w:t>0.7456 / 84.70%</w:t>
+            </w:r>
+          </w:p>
+        </w:tc>
+        <w:tc>
+          <w:tcPr>
+            <w:tcW w:type="dxa" w:w="3096"/>
+            <w:vAlign w:val="center"/>
+            <w:tcMar>
+              <w:top w:w="55" w:type="dxa"/>
+              <w:start w:w="70" w:type="dxa"/>
+              <w:bottom w:w="55" w:type="dxa"/>
+              <w:end w:w="70" w:type="dxa"/>
+            </w:tcMar>
+            <w:shd w:fill="F6F8FB"/>
+          </w:tcPr>
+          <w:p>
+            <w:pPr>
+              <w:spacing w:before="0" w:after="0" w:line="240" w:lineRule="auto"/>
+            </w:pPr>
+            <w:r/>
+            <w:r>
+              <w:rPr>
+                <w:rFonts w:ascii="Aptos" w:hAnsi="Aptos"/>
+                <w:b w:val="0"/>
+                <w:color w:val="1F2937"/>
+                <w:sz w:val="15"/>
+              </w:rPr>
+              <w:t>step 64; 0.5727</w:t>
+            </w:r>
+          </w:p>
+        </w:tc>
+      </w:tr>
+      <w:tr>
+        <w:trPr>
+          <w:cantSplit/>
+        </w:trPr>
+        <w:tc>
+          <w:tcPr>
+            <w:tcW w:type="dxa" w:w="1872"/>
+            <w:vAlign w:val="center"/>
+            <w:tcMar>
+              <w:top w:w="55" w:type="dxa"/>
+              <w:start w:w="70" w:type="dxa"/>
+              <w:bottom w:w="55" w:type="dxa"/>
+              <w:end w:w="70" w:type="dxa"/>
+            </w:tcMar>
+          </w:tcPr>
+          <w:p>
+            <w:pPr>
+              <w:spacing w:before="0" w:after="0" w:line="240" w:lineRule="auto"/>
+            </w:pPr>
+            <w:r/>
+            <w:r>
+              <w:rPr>
+                <w:rFonts w:ascii="Aptos" w:hAnsi="Aptos"/>
+                <w:b w:val="0"/>
+                <w:color w:val="1F2937"/>
+                <w:sz w:val="15"/>
+              </w:rPr>
+              <w:t>N=750; final step 282</w:t>
+            </w:r>
+          </w:p>
+        </w:tc>
+        <w:tc>
+          <w:tcPr>
+            <w:tcW w:type="dxa" w:w="2736"/>
+            <w:vAlign w:val="center"/>
+            <w:tcMar>
+              <w:top w:w="55" w:type="dxa"/>
+              <w:start w:w="70" w:type="dxa"/>
+              <w:bottom w:w="55" w:type="dxa"/>
+              <w:end w:w="70" w:type="dxa"/>
+            </w:tcMar>
+          </w:tcPr>
+          <w:p>
+            <w:pPr>
+              <w:spacing w:before="0" w:after="0" w:line="240" w:lineRule="auto"/>
+            </w:pPr>
+            <w:r/>
+            <w:r>
+              <w:rPr>
+                <w:rFonts w:ascii="Aptos" w:hAnsi="Aptos"/>
+                <w:b w:val="0"/>
+                <w:color w:val="1F2937"/>
+                <w:sz w:val="15"/>
+              </w:rPr>
+              <w:t>0.0846 / 97.70%</w:t>
+            </w:r>
+          </w:p>
+        </w:tc>
+        <w:tc>
+          <w:tcPr>
+            <w:tcW w:type="dxa" w:w="2952"/>
+            <w:vAlign w:val="center"/>
+            <w:tcMar>
+              <w:top w:w="55" w:type="dxa"/>
+              <w:start w:w="70" w:type="dxa"/>
+              <w:bottom w:w="55" w:type="dxa"/>
+              <w:end w:w="70" w:type="dxa"/>
+            </w:tcMar>
+          </w:tcPr>
+          <w:p>
+            <w:pPr>
+              <w:spacing w:before="0" w:after="0" w:line="240" w:lineRule="auto"/>
+            </w:pPr>
+            <w:r/>
+            <w:r>
+              <w:rPr>
+                <w:rFonts w:ascii="Aptos" w:hAnsi="Aptos"/>
+                <w:b w:val="0"/>
+                <w:color w:val="1F2937"/>
+                <w:sz w:val="15"/>
+              </w:rPr>
+              <w:t>0.7447 / 84.80%</w:t>
+            </w:r>
+          </w:p>
+        </w:tc>
+        <w:tc>
+          <w:tcPr>
+            <w:tcW w:type="dxa" w:w="3096"/>
+            <w:vAlign w:val="center"/>
+            <w:tcMar>
+              <w:top w:w="55" w:type="dxa"/>
+              <w:start w:w="70" w:type="dxa"/>
+              <w:bottom w:w="55" w:type="dxa"/>
+              <w:end w:w="70" w:type="dxa"/>
+            </w:tcMar>
+          </w:tcPr>
+          <w:p>
+            <w:pPr>
+              <w:spacing w:before="0" w:after="0" w:line="240" w:lineRule="auto"/>
+            </w:pPr>
+            <w:r/>
+            <w:r>
+              <w:rPr>
+                <w:rFonts w:ascii="Aptos" w:hAnsi="Aptos"/>
+                <w:b w:val="0"/>
+                <w:color w:val="1F2937"/>
+                <w:sz w:val="15"/>
+              </w:rPr>
+              <w:t>step 94; 0.5725</w:t>
+            </w:r>
+          </w:p>
+        </w:tc>
+      </w:tr>
+      <w:tr>
+        <w:trPr>
+          <w:cantSplit/>
+        </w:trPr>
+        <w:tc>
+          <w:tcPr>
+            <w:tcW w:type="dxa" w:w="1872"/>
+            <w:vAlign w:val="center"/>
+            <w:tcMar>
+              <w:top w:w="55" w:type="dxa"/>
+              <w:start w:w="70" w:type="dxa"/>
+              <w:bottom w:w="55" w:type="dxa"/>
+              <w:end w:w="70" w:type="dxa"/>
+            </w:tcMar>
+            <w:shd w:fill="F6F8FB"/>
+          </w:tcPr>
+          <w:p>
+            <w:pPr>
+              <w:spacing w:before="0" w:after="0" w:line="240" w:lineRule="auto"/>
+            </w:pPr>
+            <w:r/>
+            <w:r>
+              <w:rPr>
+                <w:rFonts w:ascii="Aptos" w:hAnsi="Aptos"/>
+                <w:b w:val="0"/>
+                <w:color w:val="1F2937"/>
+                <w:sz w:val="15"/>
+              </w:rPr>
+              <w:t>N=1600; final step 600</w:t>
+            </w:r>
+          </w:p>
+        </w:tc>
+        <w:tc>
+          <w:tcPr>
+            <w:tcW w:type="dxa" w:w="2736"/>
+            <w:vAlign w:val="center"/>
+            <w:tcMar>
+              <w:top w:w="55" w:type="dxa"/>
+              <w:start w:w="70" w:type="dxa"/>
+              <w:bottom w:w="55" w:type="dxa"/>
+              <w:end w:w="70" w:type="dxa"/>
+            </w:tcMar>
+            <w:shd w:fill="F6F8FB"/>
+          </w:tcPr>
+          <w:p>
+            <w:pPr>
+              <w:spacing w:before="0" w:after="0" w:line="240" w:lineRule="auto"/>
+            </w:pPr>
+            <w:r/>
+            <w:r>
+              <w:rPr>
+                <w:rFonts w:ascii="Aptos" w:hAnsi="Aptos"/>
+                <w:b w:val="0"/>
+                <w:color w:val="1F2937"/>
+                <w:sz w:val="15"/>
+              </w:rPr>
+              <w:t>0.0877 / 97.56%</w:t>
+            </w:r>
+          </w:p>
+        </w:tc>
+        <w:tc>
+          <w:tcPr>
+            <w:tcW w:type="dxa" w:w="2952"/>
+            <w:vAlign w:val="center"/>
+            <w:tcMar>
+              <w:top w:w="55" w:type="dxa"/>
+              <w:start w:w="70" w:type="dxa"/>
+              <w:bottom w:w="55" w:type="dxa"/>
+              <w:end w:w="70" w:type="dxa"/>
+            </w:tcMar>
+            <w:shd w:fill="F6F8FB"/>
+          </w:tcPr>
+          <w:p>
+            <w:pPr>
+              <w:spacing w:before="0" w:after="0" w:line="240" w:lineRule="auto"/>
+            </w:pPr>
+            <w:r/>
+            <w:r>
+              <w:rPr>
+                <w:rFonts w:ascii="Aptos" w:hAnsi="Aptos"/>
+                <w:b w:val="0"/>
+                <w:color w:val="1F2937"/>
+                <w:sz w:val="15"/>
+              </w:rPr>
+              <w:t>0.7249 / 84.72%</w:t>
+            </w:r>
+          </w:p>
+        </w:tc>
+        <w:tc>
+          <w:tcPr>
+            <w:tcW w:type="dxa" w:w="3096"/>
+            <w:vAlign w:val="center"/>
+            <w:tcMar>
+              <w:top w:w="55" w:type="dxa"/>
+              <w:start w:w="70" w:type="dxa"/>
+              <w:bottom w:w="55" w:type="dxa"/>
+              <w:end w:w="70" w:type="dxa"/>
+            </w:tcMar>
+            <w:shd w:fill="F6F8FB"/>
+          </w:tcPr>
+          <w:p>
+            <w:pPr>
+              <w:spacing w:before="0" w:after="0" w:line="240" w:lineRule="auto"/>
+            </w:pPr>
+            <w:r/>
+            <w:r>
+              <w:rPr>
+                <w:rFonts w:ascii="Aptos" w:hAnsi="Aptos"/>
+                <w:b w:val="0"/>
+                <w:color w:val="1F2937"/>
+                <w:sz w:val="15"/>
+              </w:rPr>
+              <w:t>step 200; 0.5787</w:t>
+            </w:r>
+          </w:p>
+        </w:tc>
+      </w:tr>
+    </w:tbl>
+    <w:p>
+      <w:pPr>
+        <w:spacing w:after="20"/>
+      </w:pPr>
+    </w:p>
+    <w:p>
+      <w:pPr>
+        <w:keepLines w:val="0"/>
+        <w:widowControl/>
+      </w:pPr>
+      <w:r>
+        <w:rPr>
+          <w:i w:val="0"/>
+        </w:rPr>
+        <w:t>At N=1,600 the best Muse validation loss was 0.5787 at step 200, whereas step 600 ended with validation loss 0.7249 despite training loss falling to 0.0877: additional training did not improve this validation-fit measure. N=509/750 also have their best saved checkpoints at epoch one. This pattern motivates checking overfitting within the Muse recipe, not declaring Gemma the factual winner. See results.jsonl and each muse-runs/*/training_summary.json; the N=1,600 completed checkpoint and metadata were hash-matched to the trainer host. No independent, human-scored factual comparison or final candidate promotion has occurred.</w:t>
       </w:r>
     </w:p>
     <w:sectPr>

</xml_diff>